<commit_message>
Add GitHub posting guide and final submission package
</commit_message>
<xml_diff>
--- a/deliverables/Adversarial_NIDS_One_Page_Summary_IITK_BCyber.docx
+++ b/deliverables/Adversarial_NIDS_One_Page_Summary_IITK_BCyber.docx
@@ -107,7 +107,18 @@
         <w:rPr>
           <w:b/>
         </w:rPr>
-        <w:t xml:space="preserve">Repository: </w:t>
+        <w:t xml:space="preserve">GitHub: </w:t>
+      </w:r>
+      <w:r>
+        <w:t>https://github.com/hitvika/adversarial-nids-cicids2017</w:t>
+      </w:r>
+    </w:p>
+    <w:p>
+      <w:r>
+        <w:rPr>
+          <w:b/>
+        </w:rPr>
+        <w:t xml:space="preserve">Local path: </w:t>
       </w:r>
       <w:r>
         <w:t>C:\Users\HP\adversarial-nids-cicids2017</w:t>

</xml_diff>

<commit_message>
Finalize submission package with live GitHub URL and updated deliverables
</commit_message>
<xml_diff>
--- a/deliverables/Adversarial_NIDS_One_Page_Summary_IITK_BCyber.docx
+++ b/deliverables/Adversarial_NIDS_One_Page_Summary_IITK_BCyber.docx
@@ -99,7 +99,7 @@
         <w:t xml:space="preserve">Reproduce: </w:t>
       </w:r>
       <w:r>
-        <w:t>python scripts/run_experiments.py</w:t>
+        <w:t>python run.py</w:t>
       </w:r>
     </w:p>
     <w:p>
@@ -110,7 +110,7 @@
         <w:t xml:space="preserve">GitHub: </w:t>
       </w:r>
       <w:r>
-        <w:t>https://github.com/hitvika/adversarial-nids-cicids2017</w:t>
+        <w:t>https://github.com/Hitvikapathak/adversarial-nids-cicids2017</w:t>
       </w:r>
     </w:p>
     <w:p>

</xml_diff>